<commit_message>
Update Phase-1 document with the core LLM results
Section B.16 now reports 63 real-LLM episodes over all five faults, replaces the
development-run example with the recorded wrong-sign sensor-bias case, and the
data and risk sections state the 200k tokens/day free-tier cap.
</commit_message>
<xml_diff>
--- a/phase1/Phase1_G3-09_23I-0746.docx
+++ b/phase1/Phase1_G3-09_23I-0746.docx
@@ -8868,7 +8868,7 @@
         <w:jc w:val="both"/>
       </w:pPr>
       <w:r>
-        <w:t xml:space="preserve">The Phase-1 evaluation suite contains 120 scenarios: five faults × two plant sizes × four mismatch levels × three seeds. Because free-tier LLM quotas are limited (8,000 tokens per minute and 1,000 requests per day per model), LLM methods are also run on a fixed 20-scenario two-zone subset. In Phase 2 the suite grows to five seeds, two noise levels and a held-out set with unseen magnitudes and compound faults. LLMs are accessed through Groq's OpenAI-compatible API: openai/gpt-oss-20b as the small model and openai/gpt-oss-120b as the large one, both with low reasoning effort. Every number in this report can be regenerated from the repository.</w:t>
+        <w:t xml:space="preserve">The Phase-1 evaluation suite contains 120 scenarios: five faults × two plant sizes × four mismatch levels × three seeds. Because free-tier LLM quotas are limited (8,000 tokens per minute and 200,000 tokens per day per model), LLM methods are run on a fixed two-zone subset; Phase 1 reports its 10-scenario core set, which covers all five faults at 0% and 20% mismatch. In Phase 2 the suite grows to five seeds, two noise levels and a held-out set with unseen magnitudes and compound faults. LLMs are accessed through Groq's OpenAI-compatible API: openai/gpt-oss-20b as the small model and openai/gpt-oss-120b as the large one, both with low reasoning effort. Every number in this report can be regenerated from the repository.</w:t>
       </w:r>
     </w:p>
     <w:p>
@@ -10763,7 +10763,7 @@
                 <w:sz w:val="18"/>
                 <w:szCs w:val="18"/>
               </w:rPr>
-              <w:t xml:space="preserve">Phase-1 suite (120 scenarios) and 20-scenario LLM subset; Phase-2 extended suite (about 200 scenarios plus a held-out set of unseen magnitudes and compound faults). Each LLM configuration is repeated three times at temperature 0.2.</w:t>
+              <w:t xml:space="preserve">Phase-1 suite (120 scenarios) and the 10-scenario LLM core set (20-scenario subset in Phase 2); Phase-2 extended suite (about 200 scenarios plus a held-out set of unseen magnitudes and compound faults). Each LLM configuration is repeated three times at temperature 0.2.</w:t>
             </w:r>
           </w:p>
         </w:tc>
@@ -11876,7 +11876,7 @@
                 <w:sz w:val="18"/>
                 <w:szCs w:val="18"/>
               </w:rPr>
-              <w:t xml:space="preserve">Free-tier LLM limits (8k tokens/min, 1k requests/day per model)</w:t>
+              <w:t xml:space="preserve">Free-tier LLM limits (8k tokens/min and 200k tokens/day per model)</w:t>
             </w:r>
           </w:p>
         </w:tc>
@@ -11908,7 +11908,7 @@
                 <w:sz w:val="18"/>
                 <w:szCs w:val="18"/>
               </w:rPr>
-              <w:t xml:space="preserve">Token-budget pacer (implemented); run the two models in parallel on separate quotas; LLM experiments on the two-zone subset; local open model through Ollama as a last resort.</w:t>
+              <w:t xml:space="preserve">Token-budget pacer and clean stop/resume at the daily cap (implemented); run the two models in parallel on separate quotas; spread long runs over several days; LLM experiments on the two-zone subset; local open model through Ollama as a last resort.</w:t>
             </w:r>
           </w:p>
         </w:tc>
@@ -12636,7 +12636,7 @@
         <w:jc w:val="both"/>
       </w:pPr>
       <w:r>
-        <w:t xml:space="preserve">The GitHub repository (https://github.com/Fatima-Khursheed20/emi-rapl-thermal, private, shared with the instructor) contains a working end-to-end system. Implemented: the multi-zone thermal plant with fault injection, mismatch and noise; per-zone PI loops; the residual-based monitor; the typed state and contracts; the plant knowledge graph; the digital twin and deterministic validator; the OpenAI-compatible LLM client with a token-budget pacer, quota handling and token accounting; the re-implemented base-paper workflow; the four baselines; the scenario suites; the evaluation runner; a trace viewer; and a report generator. Twelve unit and end-to-end tests run offline in about ten seconds. Every LLM decision is stored as an auditable trace, and every table and figure below is regenerated by scripts/make_report.py.</w:t>
+        <w:t xml:space="preserve">The GitHub repository (https://github.com/Fatima-Khursheed20/emi-rapl-thermal, private, shared with the instructor) contains a working end-to-end system. Implemented: the multi-zone thermal plant with fault injection, mismatch and noise; per-zone PI loops; the residual-based monitor; the typed state and contracts; the plant knowledge graph; the digital twin and deterministic validator; the OpenAI-compatible LLM client with a token-budget pacer, quota handling and token accounting; the re-implemented base-paper workflow; the four baselines; the scenario suites; the evaluation runner; a trace viewer; and a report generator. Twelve unit and end-to-end tests run offline in about ten seconds. Every LLM decision is stored as an auditable trace (results/*/episodes.jsonl), and every table and figure below is regenerated by scripts/make_report.py.</w:t>
       </w:r>
     </w:p>
     <w:p>
@@ -12645,7 +12645,7 @@
         <w:jc w:val="both"/>
       </w:pPr>
       <w:r>
-        <w:t xml:space="preserve">Two sets of initial results were produced. First, every non-LLM method and the base-paper workflow were run on the full 120-scenario suite. The workflow here uses a deterministic scripted proposer in place of the LLM, so that its matched-twin and nominal-twin versions see identical proposals and differ only in the twin. Second, the base-paper workflow and a single LLM call were run with two real LLMs, gpt-oss-20b and gpt-oss-120b on Groq. The LLM runs stopped when both models reached Groq's free-tier cap of 200,000 tokens per day, after 15 valid episodes, all heater-degradation scenarios. One episode containing quota-failed calls was discarded. These LLM numbers are therefore preliminary; the remaining runs resume automatically from where they stopped.</w:t>
+        <w:t xml:space="preserve">Two sets of initial results were produced. First, every non-LLM method and the base-paper workflow were run on the full 120-scenario suite. The workflow here uses a deterministic scripted proposer in place of the LLM, so that its matched-twin and nominal-twin versions see identical proposals and differ only in the twin. Second, the base-paper workflow and a single LLM call were run with two real LLMs, gpt-oss-20b and gpt-oss-120b on Groq, on a 10-scenario core set: all five fault types on the two-zone plant at 0% and 20% mismatch. This gave 63 valid episodes. gpt-oss-120b completed the whole core set; gpt-oss-20b reached Groq's free-tier cap of 200,000 tokens per day one scenario short (the stuck heater at 0% mismatch). Runs stop cleanly at the cap and resume later, and no episode contains a failed call.</w:t>
       </w:r>
     </w:p>
     <w:p>
@@ -14306,7 +14306,7 @@
         <w:jc w:val="both"/>
       </w:pPr>
       <w:r>
-        <w:t xml:space="preserve">The two twins reach that figure in very different ways, which is the central Phase-1 finding and the evidence for Gap 1. With the matched twin, the base paper's own assumption, no validated action ever failed on the true plant (0.0%). With the realistic nominal twin, 19.2% of all episodes were validated and then failed on the plant. Most of these are sensor-bias faults, where the twin assumes a −10 °C bias and so approves an offset that is wrong for the true bias (83% of sensor-bias episodes); the rest are stuck heaters (12%). The matched twin instead rejected those proposals and handed over to the fallback in 32.5% of episodes. A metric that counts validated actions as successes therefore rewards the less accurate twin: agent success is 86.7% with the nominal twin against 67.5% with the matched one. This blind spot of the base paper's success metric is why we judge every method on the hidden true plant. The rate stays at 17–20% across 0–30% parameter mismatch (Figure 3), which shows that the unknown fault magnitude, not parameter error, drives the gap. Our G1 calibration therefore estimates fault parameters such as heater gain, heat loss and sensor bias, not just plant constants. Sensor bias defeated every method (17% or less), which makes it the main target for G1 and G3.</w:t>
+        <w:t xml:space="preserve">The two twins reach that figure in very different ways, which is the central Phase-1 finding and the evidence for Gap 1. With the matched twin, the base paper's own assumption, no validated action ever failed on the true plant (0.0%). With the realistic nominal twin, 19.2% of all episodes were validated and then failed on the plant. Most of these are sensor-bias faults, where the twin assumes a −10 °C bias and so approves an offset that is wrong for the true bias (83% of sensor-bias episodes); the rest are stuck heaters (12%). The matched twin instead rejected those proposals and handed over to the fallback in 32.5% of episodes. A metric that counts validated actions as successes therefore rewards the less accurate twin: agent success is 86.7% with the nominal twin against 67.5% with the matched one. This blind spot of the base paper's success metric is why we judge every method on the hidden true plant. The rate stays at 17–20% across 0–30% parameter mismatch (Figure 3), which shows that the unknown fault magnitude, not parameter error, drives the gap. Our G1 calibration therefore estimates fault parameters such as heater gain, heat loss and sensor bias, not just plant constants.</w:t>
       </w:r>
     </w:p>
     <w:p>
@@ -14399,7 +14399,7 @@
           <w:sz w:val="20"/>
           <w:szCs w:val="20"/>
         </w:rPr>
-        <w:t xml:space="preserve">Preliminary real-LLM results on the four scenarios the LLM runs covered (two-zone heater degradation, 0% and 20% mismatch). All methods are scored on exactly these scenarios. n = episodes; Plant/Agent = plant/agent success; VbF = validated but failed; Unsafe = safety violation; Recovery = successful among reprompted episodes; Tokens and Time are per episode.</w:t>
+        <w:t xml:space="preserve">Real-LLM results on the scenarios the LLM runs covered (two-zone plant: the 10-scenario core set, all five faults at 0% and 20% mismatch, plus two extra heater-degradation scenarios). All methods are scored on exactly these scenarios. n = episodes; Plant/Agent = plant/agent success; VbF = validated but failed; Unsafe = safety violation; Recovery = successful among reprompted episodes; Tokens and Time are per episode.</w:t>
       </w:r>
     </w:p>
     <w:tbl>
@@ -14416,17 +14416,17 @@
         <w:tblLayout w:type="fixed"/>
       </w:tblPr>
       <w:tblGrid>
-        <w:gridCol w:w="2426"/>
+        <w:gridCol w:w="2226"/>
         <w:gridCol w:w="350"/>
-        <w:gridCol w:w="620"/>
-        <w:gridCol w:w="620"/>
-        <w:gridCol w:w="620"/>
-        <w:gridCol w:w="650"/>
-        <w:gridCol w:w="800"/>
-        <w:gridCol w:w="780"/>
+        <w:gridCol w:w="600"/>
+        <w:gridCol w:w="600"/>
         <w:gridCol w:w="560"/>
-        <w:gridCol w:w="650"/>
-        <w:gridCol w:w="950"/>
+        <w:gridCol w:w="700"/>
+        <w:gridCol w:w="820"/>
+        <w:gridCol w:w="860"/>
+        <w:gridCol w:w="560"/>
+        <w:gridCol w:w="700"/>
+        <w:gridCol w:w="1050"/>
       </w:tblGrid>
       <w:tr>
         <w:trPr>
@@ -14434,7 +14434,7 @@
         </w:trPr>
         <w:tc>
           <w:tcPr>
-            <w:tcW w:type="dxa" w:w="2426"/>
+            <w:tcW w:type="dxa" w:w="2226"/>
             <w:tcBorders>
               <w:top w:val="single" w:color="999999" w:sz="4"/>
               <w:left w:val="single" w:color="999999" w:sz="4"/>
@@ -14504,7 +14504,7 @@
         </w:tc>
         <w:tc>
           <w:tcPr>
-            <w:tcW w:type="dxa" w:w="620"/>
+            <w:tcW w:type="dxa" w:w="600"/>
             <w:tcBorders>
               <w:top w:val="single" w:color="999999" w:sz="4"/>
               <w:left w:val="single" w:color="999999" w:sz="4"/>
@@ -14539,7 +14539,7 @@
         </w:tc>
         <w:tc>
           <w:tcPr>
-            <w:tcW w:type="dxa" w:w="620"/>
+            <w:tcW w:type="dxa" w:w="600"/>
             <w:tcBorders>
               <w:top w:val="single" w:color="999999" w:sz="4"/>
               <w:left w:val="single" w:color="999999" w:sz="4"/>
@@ -14574,7 +14574,7 @@
         </w:tc>
         <w:tc>
           <w:tcPr>
-            <w:tcW w:type="dxa" w:w="620"/>
+            <w:tcW w:type="dxa" w:w="560"/>
             <w:tcBorders>
               <w:top w:val="single" w:color="999999" w:sz="4"/>
               <w:left w:val="single" w:color="999999" w:sz="4"/>
@@ -14609,7 +14609,7 @@
         </w:tc>
         <w:tc>
           <w:tcPr>
-            <w:tcW w:type="dxa" w:w="650"/>
+            <w:tcW w:type="dxa" w:w="700"/>
             <w:tcBorders>
               <w:top w:val="single" w:color="999999" w:sz="4"/>
               <w:left w:val="single" w:color="999999" w:sz="4"/>
@@ -14644,7 +14644,7 @@
         </w:tc>
         <w:tc>
           <w:tcPr>
-            <w:tcW w:type="dxa" w:w="800"/>
+            <w:tcW w:type="dxa" w:w="820"/>
             <w:tcBorders>
               <w:top w:val="single" w:color="999999" w:sz="4"/>
               <w:left w:val="single" w:color="999999" w:sz="4"/>
@@ -14673,13 +14673,13 @@
                 <w:sz w:val="17"/>
                 <w:szCs w:val="17"/>
               </w:rPr>
-              <w:t xml:space="preserve">Reprompts</w:t>
-            </w:r>
-          </w:p>
-        </w:tc>
-        <w:tc>
-          <w:tcPr>
-            <w:tcW w:type="dxa" w:w="780"/>
+              <w:t xml:space="preserve">Re-prompts</w:t>
+            </w:r>
+          </w:p>
+        </w:tc>
+        <w:tc>
+          <w:tcPr>
+            <w:tcW w:type="dxa" w:w="860"/>
             <w:tcBorders>
               <w:top w:val="single" w:color="999999" w:sz="4"/>
               <w:left w:val="single" w:color="999999" w:sz="4"/>
@@ -14749,7 +14749,7 @@
         </w:tc>
         <w:tc>
           <w:tcPr>
-            <w:tcW w:type="dxa" w:w="650"/>
+            <w:tcW w:type="dxa" w:w="700"/>
             <w:tcBorders>
               <w:top w:val="single" w:color="999999" w:sz="4"/>
               <w:left w:val="single" w:color="999999" w:sz="4"/>
@@ -14784,7 +14784,7 @@
         </w:tc>
         <w:tc>
           <w:tcPr>
-            <w:tcW w:type="dxa" w:w="950"/>
+            <w:tcW w:type="dxa" w:w="1050"/>
             <w:tcBorders>
               <w:top w:val="single" w:color="999999" w:sz="4"/>
               <w:left w:val="single" w:color="999999" w:sz="4"/>
@@ -14824,7 +14824,7 @@
         </w:trPr>
         <w:tc>
           <w:tcPr>
-            <w:tcW w:type="dxa" w:w="2426"/>
+            <w:tcW w:type="dxa" w:w="2226"/>
             <w:tcBorders>
               <w:top w:val="single" w:color="999999" w:sz="4"/>
               <w:left w:val="single" w:color="999999" w:sz="4"/>
@@ -14882,13 +14882,13 @@
                 <w:sz w:val="17"/>
                 <w:szCs w:val="17"/>
               </w:rPr>
-              <w:t xml:space="preserve">4</w:t>
-            </w:r>
-          </w:p>
-        </w:tc>
-        <w:tc>
-          <w:tcPr>
-            <w:tcW w:type="dxa" w:w="620"/>
+              <w:t xml:space="preserve">12</w:t>
+            </w:r>
+          </w:p>
+        </w:tc>
+        <w:tc>
+          <w:tcPr>
+            <w:tcW w:type="dxa" w:w="600"/>
             <w:tcBorders>
               <w:top w:val="single" w:color="999999" w:sz="4"/>
               <w:left w:val="single" w:color="999999" w:sz="4"/>
@@ -14920,7 +14920,7 @@
         </w:tc>
         <w:tc>
           <w:tcPr>
-            <w:tcW w:type="dxa" w:w="620"/>
+            <w:tcW w:type="dxa" w:w="600"/>
             <w:tcBorders>
               <w:top w:val="single" w:color="999999" w:sz="4"/>
               <w:left w:val="single" w:color="999999" w:sz="4"/>
@@ -14952,7 +14952,7 @@
         </w:tc>
         <w:tc>
           <w:tcPr>
-            <w:tcW w:type="dxa" w:w="620"/>
+            <w:tcW w:type="dxa" w:w="560"/>
             <w:tcBorders>
               <w:top w:val="single" w:color="999999" w:sz="4"/>
               <w:left w:val="single" w:color="999999" w:sz="4"/>
@@ -14984,7 +14984,7 @@
         </w:tc>
         <w:tc>
           <w:tcPr>
-            <w:tcW w:type="dxa" w:w="650"/>
+            <w:tcW w:type="dxa" w:w="700"/>
             <w:tcBorders>
               <w:top w:val="single" w:color="999999" w:sz="4"/>
               <w:left w:val="single" w:color="999999" w:sz="4"/>
@@ -15016,7 +15016,7 @@
         </w:tc>
         <w:tc>
           <w:tcPr>
-            <w:tcW w:type="dxa" w:w="800"/>
+            <w:tcW w:type="dxa" w:w="820"/>
             <w:tcBorders>
               <w:top w:val="single" w:color="999999" w:sz="4"/>
               <w:left w:val="single" w:color="999999" w:sz="4"/>
@@ -15048,7 +15048,7 @@
         </w:tc>
         <w:tc>
           <w:tcPr>
-            <w:tcW w:type="dxa" w:w="780"/>
+            <w:tcW w:type="dxa" w:w="860"/>
             <w:tcBorders>
               <w:top w:val="single" w:color="999999" w:sz="4"/>
               <w:left w:val="single" w:color="999999" w:sz="4"/>
@@ -15112,7 +15112,7 @@
         </w:tc>
         <w:tc>
           <w:tcPr>
-            <w:tcW w:type="dxa" w:w="650"/>
+            <w:tcW w:type="dxa" w:w="700"/>
             <w:tcBorders>
               <w:top w:val="single" w:color="999999" w:sz="4"/>
               <w:left w:val="single" w:color="999999" w:sz="4"/>
@@ -15144,7 +15144,7 @@
         </w:tc>
         <w:tc>
           <w:tcPr>
-            <w:tcW w:type="dxa" w:w="950"/>
+            <w:tcW w:type="dxa" w:w="1050"/>
             <w:tcBorders>
               <w:top w:val="single" w:color="999999" w:sz="4"/>
               <w:left w:val="single" w:color="999999" w:sz="4"/>
@@ -15181,7 +15181,7 @@
         </w:trPr>
         <w:tc>
           <w:tcPr>
-            <w:tcW w:type="dxa" w:w="2426"/>
+            <w:tcW w:type="dxa" w:w="2226"/>
             <w:tcBorders>
               <w:top w:val="single" w:color="999999" w:sz="4"/>
               <w:left w:val="single" w:color="999999" w:sz="4"/>
@@ -15239,13 +15239,13 @@
                 <w:sz w:val="17"/>
                 <w:szCs w:val="17"/>
               </w:rPr>
-              <w:t xml:space="preserve">4</w:t>
-            </w:r>
-          </w:p>
-        </w:tc>
-        <w:tc>
-          <w:tcPr>
-            <w:tcW w:type="dxa" w:w="620"/>
+              <w:t xml:space="preserve">12</w:t>
+            </w:r>
+          </w:p>
+        </w:tc>
+        <w:tc>
+          <w:tcPr>
+            <w:tcW w:type="dxa" w:w="600"/>
             <w:tcBorders>
               <w:top w:val="single" w:color="999999" w:sz="4"/>
               <w:left w:val="single" w:color="999999" w:sz="4"/>
@@ -15271,13 +15271,13 @@
                 <w:sz w:val="17"/>
                 <w:szCs w:val="17"/>
               </w:rPr>
-              <w:t xml:space="preserve">100.0</w:t>
-            </w:r>
-          </w:p>
-        </w:tc>
-        <w:tc>
-          <w:tcPr>
-            <w:tcW w:type="dxa" w:w="620"/>
+              <w:t xml:space="preserve">83.3</w:t>
+            </w:r>
+          </w:p>
+        </w:tc>
+        <w:tc>
+          <w:tcPr>
+            <w:tcW w:type="dxa" w:w="600"/>
             <w:tcBorders>
               <w:top w:val="single" w:color="999999" w:sz="4"/>
               <w:left w:val="single" w:color="999999" w:sz="4"/>
@@ -15309,7 +15309,7 @@
         </w:tc>
         <w:tc>
           <w:tcPr>
-            <w:tcW w:type="dxa" w:w="620"/>
+            <w:tcW w:type="dxa" w:w="560"/>
             <w:tcBorders>
               <w:top w:val="single" w:color="999999" w:sz="4"/>
               <w:left w:val="single" w:color="999999" w:sz="4"/>
@@ -15341,7 +15341,7 @@
         </w:tc>
         <w:tc>
           <w:tcPr>
-            <w:tcW w:type="dxa" w:w="650"/>
+            <w:tcW w:type="dxa" w:w="700"/>
             <w:tcBorders>
               <w:top w:val="single" w:color="999999" w:sz="4"/>
               <w:left w:val="single" w:color="999999" w:sz="4"/>
@@ -15373,7 +15373,7 @@
         </w:tc>
         <w:tc>
           <w:tcPr>
-            <w:tcW w:type="dxa" w:w="800"/>
+            <w:tcW w:type="dxa" w:w="820"/>
             <w:tcBorders>
               <w:top w:val="single" w:color="999999" w:sz="4"/>
               <w:left w:val="single" w:color="999999" w:sz="4"/>
@@ -15405,7 +15405,7 @@
         </w:tc>
         <w:tc>
           <w:tcPr>
-            <w:tcW w:type="dxa" w:w="780"/>
+            <w:tcW w:type="dxa" w:w="860"/>
             <w:tcBorders>
               <w:top w:val="single" w:color="999999" w:sz="4"/>
               <w:left w:val="single" w:color="999999" w:sz="4"/>
@@ -15469,7 +15469,7 @@
         </w:tc>
         <w:tc>
           <w:tcPr>
-            <w:tcW w:type="dxa" w:w="650"/>
+            <w:tcW w:type="dxa" w:w="700"/>
             <w:tcBorders>
               <w:top w:val="single" w:color="999999" w:sz="4"/>
               <w:left w:val="single" w:color="999999" w:sz="4"/>
@@ -15501,7 +15501,7 @@
         </w:tc>
         <w:tc>
           <w:tcPr>
-            <w:tcW w:type="dxa" w:w="950"/>
+            <w:tcW w:type="dxa" w:w="1050"/>
             <w:tcBorders>
               <w:top w:val="single" w:color="999999" w:sz="4"/>
               <w:left w:val="single" w:color="999999" w:sz="4"/>
@@ -15538,7 +15538,7 @@
         </w:trPr>
         <w:tc>
           <w:tcPr>
-            <w:tcW w:type="dxa" w:w="2426"/>
+            <w:tcW w:type="dxa" w:w="2226"/>
             <w:tcBorders>
               <w:top w:val="single" w:color="999999" w:sz="4"/>
               <w:left w:val="single" w:color="999999" w:sz="4"/>
@@ -15596,13 +15596,13 @@
                 <w:sz w:val="17"/>
                 <w:szCs w:val="17"/>
               </w:rPr>
-              <w:t xml:space="preserve">4</w:t>
-            </w:r>
-          </w:p>
-        </w:tc>
-        <w:tc>
-          <w:tcPr>
-            <w:tcW w:type="dxa" w:w="620"/>
+              <w:t xml:space="preserve">12</w:t>
+            </w:r>
+          </w:p>
+        </w:tc>
+        <w:tc>
+          <w:tcPr>
+            <w:tcW w:type="dxa" w:w="600"/>
             <w:tcBorders>
               <w:top w:val="single" w:color="999999" w:sz="4"/>
               <w:left w:val="single" w:color="999999" w:sz="4"/>
@@ -15628,13 +15628,13 @@
                 <w:sz w:val="17"/>
                 <w:szCs w:val="17"/>
               </w:rPr>
-              <w:t xml:space="preserve">100.0</w:t>
-            </w:r>
-          </w:p>
-        </w:tc>
-        <w:tc>
-          <w:tcPr>
-            <w:tcW w:type="dxa" w:w="620"/>
+              <w:t xml:space="preserve">91.7</w:t>
+            </w:r>
+          </w:p>
+        </w:tc>
+        <w:tc>
+          <w:tcPr>
+            <w:tcW w:type="dxa" w:w="600"/>
             <w:tcBorders>
               <w:top w:val="single" w:color="999999" w:sz="4"/>
               <w:left w:val="single" w:color="999999" w:sz="4"/>
@@ -15666,7 +15666,7 @@
         </w:tc>
         <w:tc>
           <w:tcPr>
-            <w:tcW w:type="dxa" w:w="620"/>
+            <w:tcW w:type="dxa" w:w="560"/>
             <w:tcBorders>
               <w:top w:val="single" w:color="999999" w:sz="4"/>
               <w:left w:val="single" w:color="999999" w:sz="4"/>
@@ -15698,7 +15698,7 @@
         </w:tc>
         <w:tc>
           <w:tcPr>
-            <w:tcW w:type="dxa" w:w="650"/>
+            <w:tcW w:type="dxa" w:w="700"/>
             <w:tcBorders>
               <w:top w:val="single" w:color="999999" w:sz="4"/>
               <w:left w:val="single" w:color="999999" w:sz="4"/>
@@ -15730,7 +15730,7 @@
         </w:tc>
         <w:tc>
           <w:tcPr>
-            <w:tcW w:type="dxa" w:w="800"/>
+            <w:tcW w:type="dxa" w:w="820"/>
             <w:tcBorders>
               <w:top w:val="single" w:color="999999" w:sz="4"/>
               <w:left w:val="single" w:color="999999" w:sz="4"/>
@@ -15762,7 +15762,7 @@
         </w:tc>
         <w:tc>
           <w:tcPr>
-            <w:tcW w:type="dxa" w:w="780"/>
+            <w:tcW w:type="dxa" w:w="860"/>
             <w:tcBorders>
               <w:top w:val="single" w:color="999999" w:sz="4"/>
               <w:left w:val="single" w:color="999999" w:sz="4"/>
@@ -15826,7 +15826,7 @@
         </w:tc>
         <w:tc>
           <w:tcPr>
-            <w:tcW w:type="dxa" w:w="650"/>
+            <w:tcW w:type="dxa" w:w="700"/>
             <w:tcBorders>
               <w:top w:val="single" w:color="999999" w:sz="4"/>
               <w:left w:val="single" w:color="999999" w:sz="4"/>
@@ -15858,7 +15858,7 @@
         </w:tc>
         <w:tc>
           <w:tcPr>
-            <w:tcW w:type="dxa" w:w="950"/>
+            <w:tcW w:type="dxa" w:w="1050"/>
             <w:tcBorders>
               <w:top w:val="single" w:color="999999" w:sz="4"/>
               <w:left w:val="single" w:color="999999" w:sz="4"/>
@@ -15884,7 +15884,7 @@
                 <w:sz w:val="17"/>
                 <w:szCs w:val="17"/>
               </w:rPr>
-              <w:t xml:space="preserve">79</w:t>
+              <w:t xml:space="preserve">104</w:t>
             </w:r>
           </w:p>
         </w:tc>
@@ -15895,7 +15895,7 @@
         </w:trPr>
         <w:tc>
           <w:tcPr>
-            <w:tcW w:type="dxa" w:w="2426"/>
+            <w:tcW w:type="dxa" w:w="2226"/>
             <w:tcBorders>
               <w:top w:val="single" w:color="999999" w:sz="4"/>
               <w:left w:val="single" w:color="999999" w:sz="4"/>
@@ -15953,13 +15953,13 @@
                 <w:sz w:val="17"/>
                 <w:szCs w:val="17"/>
               </w:rPr>
-              <w:t xml:space="preserve">4</w:t>
-            </w:r>
-          </w:p>
-        </w:tc>
-        <w:tc>
-          <w:tcPr>
-            <w:tcW w:type="dxa" w:w="620"/>
+              <w:t xml:space="preserve">12</w:t>
+            </w:r>
+          </w:p>
+        </w:tc>
+        <w:tc>
+          <w:tcPr>
+            <w:tcW w:type="dxa" w:w="600"/>
             <w:tcBorders>
               <w:top w:val="single" w:color="999999" w:sz="4"/>
               <w:left w:val="single" w:color="999999" w:sz="4"/>
@@ -15985,13 +15985,13 @@
                 <w:sz w:val="17"/>
                 <w:szCs w:val="17"/>
               </w:rPr>
-              <w:t xml:space="preserve">25.0</w:t>
-            </w:r>
-          </w:p>
-        </w:tc>
-        <w:tc>
-          <w:tcPr>
-            <w:tcW w:type="dxa" w:w="620"/>
+              <w:t xml:space="preserve">41.7</w:t>
+            </w:r>
+          </w:p>
+        </w:tc>
+        <w:tc>
+          <w:tcPr>
+            <w:tcW w:type="dxa" w:w="600"/>
             <w:tcBorders>
               <w:top w:val="single" w:color="999999" w:sz="4"/>
               <w:left w:val="single" w:color="999999" w:sz="4"/>
@@ -16023,7 +16023,7 @@
         </w:tc>
         <w:tc>
           <w:tcPr>
-            <w:tcW w:type="dxa" w:w="620"/>
+            <w:tcW w:type="dxa" w:w="560"/>
             <w:tcBorders>
               <w:top w:val="single" w:color="999999" w:sz="4"/>
               <w:left w:val="single" w:color="999999" w:sz="4"/>
@@ -16055,7 +16055,7 @@
         </w:tc>
         <w:tc>
           <w:tcPr>
-            <w:tcW w:type="dxa" w:w="650"/>
+            <w:tcW w:type="dxa" w:w="700"/>
             <w:tcBorders>
               <w:top w:val="single" w:color="999999" w:sz="4"/>
               <w:left w:val="single" w:color="999999" w:sz="4"/>
@@ -16087,7 +16087,7 @@
         </w:tc>
         <w:tc>
           <w:tcPr>
-            <w:tcW w:type="dxa" w:w="800"/>
+            <w:tcW w:type="dxa" w:w="820"/>
             <w:tcBorders>
               <w:top w:val="single" w:color="999999" w:sz="4"/>
               <w:left w:val="single" w:color="999999" w:sz="4"/>
@@ -16119,7 +16119,7 @@
         </w:tc>
         <w:tc>
           <w:tcPr>
-            <w:tcW w:type="dxa" w:w="780"/>
+            <w:tcW w:type="dxa" w:w="860"/>
             <w:tcBorders>
               <w:top w:val="single" w:color="999999" w:sz="4"/>
               <w:left w:val="single" w:color="999999" w:sz="4"/>
@@ -16183,7 +16183,7 @@
         </w:tc>
         <w:tc>
           <w:tcPr>
-            <w:tcW w:type="dxa" w:w="650"/>
+            <w:tcW w:type="dxa" w:w="700"/>
             <w:tcBorders>
               <w:top w:val="single" w:color="999999" w:sz="4"/>
               <w:left w:val="single" w:color="999999" w:sz="4"/>
@@ -16215,7 +16215,7 @@
         </w:tc>
         <w:tc>
           <w:tcPr>
-            <w:tcW w:type="dxa" w:w="950"/>
+            <w:tcW w:type="dxa" w:w="1050"/>
             <w:tcBorders>
               <w:top w:val="single" w:color="999999" w:sz="4"/>
               <w:left w:val="single" w:color="999999" w:sz="4"/>
@@ -16241,7 +16241,7 @@
                 <w:sz w:val="17"/>
                 <w:szCs w:val="17"/>
               </w:rPr>
-              <w:t xml:space="preserve">2</w:t>
+              <w:t xml:space="preserve">11</w:t>
             </w:r>
           </w:p>
         </w:tc>
@@ -16252,7 +16252,7 @@
         </w:trPr>
         <w:tc>
           <w:tcPr>
-            <w:tcW w:type="dxa" w:w="2426"/>
+            <w:tcW w:type="dxa" w:w="2226"/>
             <w:tcBorders>
               <w:top w:val="single" w:color="999999" w:sz="4"/>
               <w:left w:val="single" w:color="999999" w:sz="4"/>
@@ -16310,13 +16310,13 @@
                 <w:sz w:val="17"/>
                 <w:szCs w:val="17"/>
               </w:rPr>
-              <w:t xml:space="preserve">2</w:t>
-            </w:r>
-          </w:p>
-        </w:tc>
-        <w:tc>
-          <w:tcPr>
-            <w:tcW w:type="dxa" w:w="620"/>
+              <w:t xml:space="preserve">10</w:t>
+            </w:r>
+          </w:p>
+        </w:tc>
+        <w:tc>
+          <w:tcPr>
+            <w:tcW w:type="dxa" w:w="600"/>
             <w:tcBorders>
               <w:top w:val="single" w:color="999999" w:sz="4"/>
               <w:left w:val="single" w:color="999999" w:sz="4"/>
@@ -16342,13 +16342,13 @@
                 <w:sz w:val="17"/>
                 <w:szCs w:val="17"/>
               </w:rPr>
-              <w:t xml:space="preserve">0.0</w:t>
-            </w:r>
-          </w:p>
-        </w:tc>
-        <w:tc>
-          <w:tcPr>
-            <w:tcW w:type="dxa" w:w="620"/>
+              <w:t xml:space="preserve">20.0</w:t>
+            </w:r>
+          </w:p>
+        </w:tc>
+        <w:tc>
+          <w:tcPr>
+            <w:tcW w:type="dxa" w:w="600"/>
             <w:tcBorders>
               <w:top w:val="single" w:color="999999" w:sz="4"/>
               <w:left w:val="single" w:color="999999" w:sz="4"/>
@@ -16380,7 +16380,7 @@
         </w:tc>
         <w:tc>
           <w:tcPr>
-            <w:tcW w:type="dxa" w:w="620"/>
+            <w:tcW w:type="dxa" w:w="560"/>
             <w:tcBorders>
               <w:top w:val="single" w:color="999999" w:sz="4"/>
               <w:left w:val="single" w:color="999999" w:sz="4"/>
@@ -16412,7 +16412,7 @@
         </w:tc>
         <w:tc>
           <w:tcPr>
-            <w:tcW w:type="dxa" w:w="650"/>
+            <w:tcW w:type="dxa" w:w="700"/>
             <w:tcBorders>
               <w:top w:val="single" w:color="999999" w:sz="4"/>
               <w:left w:val="single" w:color="999999" w:sz="4"/>
@@ -16438,13 +16438,13 @@
                 <w:sz w:val="17"/>
                 <w:szCs w:val="17"/>
               </w:rPr>
-              <w:t xml:space="preserve">0.0</w:t>
-            </w:r>
-          </w:p>
-        </w:tc>
-        <w:tc>
-          <w:tcPr>
-            <w:tcW w:type="dxa" w:w="800"/>
+              <w:t xml:space="preserve">20.0</w:t>
+            </w:r>
+          </w:p>
+        </w:tc>
+        <w:tc>
+          <w:tcPr>
+            <w:tcW w:type="dxa" w:w="820"/>
             <w:tcBorders>
               <w:top w:val="single" w:color="999999" w:sz="4"/>
               <w:left w:val="single" w:color="999999" w:sz="4"/>
@@ -16476,7 +16476,7 @@
         </w:tc>
         <w:tc>
           <w:tcPr>
-            <w:tcW w:type="dxa" w:w="780"/>
+            <w:tcW w:type="dxa" w:w="860"/>
             <w:tcBorders>
               <w:top w:val="single" w:color="999999" w:sz="4"/>
               <w:left w:val="single" w:color="999999" w:sz="4"/>
@@ -16540,7 +16540,7 @@
         </w:tc>
         <w:tc>
           <w:tcPr>
-            <w:tcW w:type="dxa" w:w="650"/>
+            <w:tcW w:type="dxa" w:w="700"/>
             <w:tcBorders>
               <w:top w:val="single" w:color="999999" w:sz="4"/>
               <w:left w:val="single" w:color="999999" w:sz="4"/>
@@ -16572,7 +16572,7 @@
         </w:tc>
         <w:tc>
           <w:tcPr>
-            <w:tcW w:type="dxa" w:w="950"/>
+            <w:tcW w:type="dxa" w:w="1050"/>
             <w:tcBorders>
               <w:top w:val="single" w:color="999999" w:sz="4"/>
               <w:left w:val="single" w:color="999999" w:sz="4"/>
@@ -16598,7 +16598,7 @@
                 <w:sz w:val="17"/>
                 <w:szCs w:val="17"/>
               </w:rPr>
-              <w:t xml:space="preserve">2</w:t>
+              <w:t xml:space="preserve">7</w:t>
             </w:r>
           </w:p>
         </w:tc>
@@ -16609,7 +16609,7 @@
         </w:trPr>
         <w:tc>
           <w:tcPr>
-            <w:tcW w:type="dxa" w:w="2426"/>
+            <w:tcW w:type="dxa" w:w="2226"/>
             <w:tcBorders>
               <w:top w:val="single" w:color="999999" w:sz="4"/>
               <w:left w:val="single" w:color="999999" w:sz="4"/>
@@ -16667,13 +16667,13 @@
                 <w:sz w:val="17"/>
                 <w:szCs w:val="17"/>
               </w:rPr>
-              <w:t xml:space="preserve">3</w:t>
-            </w:r>
-          </w:p>
-        </w:tc>
-        <w:tc>
-          <w:tcPr>
-            <w:tcW w:type="dxa" w:w="620"/>
+              <w:t xml:space="preserve">11</w:t>
+            </w:r>
+          </w:p>
+        </w:tc>
+        <w:tc>
+          <w:tcPr>
+            <w:tcW w:type="dxa" w:w="600"/>
             <w:tcBorders>
               <w:top w:val="single" w:color="999999" w:sz="4"/>
               <w:left w:val="single" w:color="999999" w:sz="4"/>
@@ -16705,7 +16705,7 @@
         </w:tc>
         <w:tc>
           <w:tcPr>
-            <w:tcW w:type="dxa" w:w="620"/>
+            <w:tcW w:type="dxa" w:w="600"/>
             <w:tcBorders>
               <w:top w:val="single" w:color="999999" w:sz="4"/>
               <w:left w:val="single" w:color="999999" w:sz="4"/>
@@ -16731,13 +16731,13 @@
                 <w:sz w:val="17"/>
                 <w:szCs w:val="17"/>
               </w:rPr>
-              <w:t xml:space="preserve">66.7</w:t>
-            </w:r>
-          </w:p>
-        </w:tc>
-        <w:tc>
-          <w:tcPr>
-            <w:tcW w:type="dxa" w:w="620"/>
+              <w:t xml:space="preserve">63.6</w:t>
+            </w:r>
+          </w:p>
+        </w:tc>
+        <w:tc>
+          <w:tcPr>
+            <w:tcW w:type="dxa" w:w="560"/>
             <w:tcBorders>
               <w:top w:val="single" w:color="999999" w:sz="4"/>
               <w:left w:val="single" w:color="999999" w:sz="4"/>
@@ -16769,7 +16769,7 @@
         </w:tc>
         <w:tc>
           <w:tcPr>
-            <w:tcW w:type="dxa" w:w="650"/>
+            <w:tcW w:type="dxa" w:w="700"/>
             <w:tcBorders>
               <w:top w:val="single" w:color="999999" w:sz="4"/>
               <w:left w:val="single" w:color="999999" w:sz="4"/>
@@ -16801,7 +16801,7 @@
         </w:tc>
         <w:tc>
           <w:tcPr>
-            <w:tcW w:type="dxa" w:w="800"/>
+            <w:tcW w:type="dxa" w:w="820"/>
             <w:tcBorders>
               <w:top w:val="single" w:color="999999" w:sz="4"/>
               <w:left w:val="single" w:color="999999" w:sz="4"/>
@@ -16827,13 +16827,13 @@
                 <w:sz w:val="17"/>
                 <w:szCs w:val="17"/>
               </w:rPr>
-              <w:t xml:space="preserve">2.67</w:t>
-            </w:r>
-          </w:p>
-        </w:tc>
-        <w:tc>
-          <w:tcPr>
-            <w:tcW w:type="dxa" w:w="780"/>
+              <w:t xml:space="preserve">2.36</w:t>
+            </w:r>
+          </w:p>
+        </w:tc>
+        <w:tc>
+          <w:tcPr>
+            <w:tcW w:type="dxa" w:w="860"/>
             <w:tcBorders>
               <w:top w:val="single" w:color="999999" w:sz="4"/>
               <w:left w:val="single" w:color="999999" w:sz="4"/>
@@ -16859,7 +16859,7 @@
                 <w:sz w:val="17"/>
                 <w:szCs w:val="17"/>
               </w:rPr>
-              <w:t xml:space="preserve">50.0</w:t>
+              <w:t xml:space="preserve">33.3</w:t>
             </w:r>
           </w:p>
         </w:tc>
@@ -16891,13 +16891,13 @@
                 <w:sz w:val="17"/>
                 <w:szCs w:val="17"/>
               </w:rPr>
-              <w:t xml:space="preserve">4.7</w:t>
-            </w:r>
-          </w:p>
-        </w:tc>
-        <w:tc>
-          <w:tcPr>
-            <w:tcW w:type="dxa" w:w="650"/>
+              <w:t xml:space="preserve">4.4</w:t>
+            </w:r>
+          </w:p>
+        </w:tc>
+        <w:tc>
+          <w:tcPr>
+            <w:tcW w:type="dxa" w:w="700"/>
             <w:tcBorders>
               <w:top w:val="single" w:color="999999" w:sz="4"/>
               <w:left w:val="single" w:color="999999" w:sz="4"/>
@@ -16923,13 +16923,13 @@
                 <w:sz w:val="17"/>
                 <w:szCs w:val="17"/>
               </w:rPr>
-              <w:t xml:space="preserve">11.7k</w:t>
-            </w:r>
-          </w:p>
-        </w:tc>
-        <w:tc>
-          <w:tcPr>
-            <w:tcW w:type="dxa" w:w="950"/>
+              <w:t xml:space="preserve">11.2k</w:t>
+            </w:r>
+          </w:p>
+        </w:tc>
+        <w:tc>
+          <w:tcPr>
+            <w:tcW w:type="dxa" w:w="1050"/>
             <w:tcBorders>
               <w:top w:val="single" w:color="999999" w:sz="4"/>
               <w:left w:val="single" w:color="999999" w:sz="4"/>
@@ -16955,7 +16955,7 @@
                 <w:sz w:val="17"/>
                 <w:szCs w:val="17"/>
               </w:rPr>
-              <w:t xml:space="preserve">123</w:t>
+              <w:t xml:space="preserve">113</w:t>
             </w:r>
           </w:p>
         </w:tc>
@@ -16966,7 +16966,7 @@
         </w:trPr>
         <w:tc>
           <w:tcPr>
-            <w:tcW w:type="dxa" w:w="2426"/>
+            <w:tcW w:type="dxa" w:w="2226"/>
             <w:tcBorders>
               <w:top w:val="single" w:color="999999" w:sz="4"/>
               <w:left w:val="single" w:color="999999" w:sz="4"/>
@@ -17024,13 +17024,13 @@
                 <w:sz w:val="17"/>
                 <w:szCs w:val="17"/>
               </w:rPr>
-              <w:t xml:space="preserve">2</w:t>
-            </w:r>
-          </w:p>
-        </w:tc>
-        <w:tc>
-          <w:tcPr>
-            <w:tcW w:type="dxa" w:w="620"/>
+              <w:t xml:space="preserve">10</w:t>
+            </w:r>
+          </w:p>
+        </w:tc>
+        <w:tc>
+          <w:tcPr>
+            <w:tcW w:type="dxa" w:w="600"/>
             <w:tcBorders>
               <w:top w:val="single" w:color="999999" w:sz="4"/>
               <w:left w:val="single" w:color="999999" w:sz="4"/>
@@ -17062,7 +17062,7 @@
         </w:tc>
         <w:tc>
           <w:tcPr>
-            <w:tcW w:type="dxa" w:w="620"/>
+            <w:tcW w:type="dxa" w:w="600"/>
             <w:tcBorders>
               <w:top w:val="single" w:color="999999" w:sz="4"/>
               <w:left w:val="single" w:color="999999" w:sz="4"/>
@@ -17088,13 +17088,13 @@
                 <w:sz w:val="17"/>
                 <w:szCs w:val="17"/>
               </w:rPr>
-              <w:t xml:space="preserve">50.0</w:t>
-            </w:r>
-          </w:p>
-        </w:tc>
-        <w:tc>
-          <w:tcPr>
-            <w:tcW w:type="dxa" w:w="620"/>
+              <w:t xml:space="preserve">60.0</w:t>
+            </w:r>
+          </w:p>
+        </w:tc>
+        <w:tc>
+          <w:tcPr>
+            <w:tcW w:type="dxa" w:w="560"/>
             <w:tcBorders>
               <w:top w:val="single" w:color="999999" w:sz="4"/>
               <w:left w:val="single" w:color="999999" w:sz="4"/>
@@ -17126,7 +17126,7 @@
         </w:tc>
         <w:tc>
           <w:tcPr>
-            <w:tcW w:type="dxa" w:w="650"/>
+            <w:tcW w:type="dxa" w:w="700"/>
             <w:tcBorders>
               <w:top w:val="single" w:color="999999" w:sz="4"/>
               <w:left w:val="single" w:color="999999" w:sz="4"/>
@@ -17158,7 +17158,7 @@
         </w:tc>
         <w:tc>
           <w:tcPr>
-            <w:tcW w:type="dxa" w:w="800"/>
+            <w:tcW w:type="dxa" w:w="820"/>
             <w:tcBorders>
               <w:top w:val="single" w:color="999999" w:sz="4"/>
               <w:left w:val="single" w:color="999999" w:sz="4"/>
@@ -17184,13 +17184,13 @@
                 <w:sz w:val="17"/>
                 <w:szCs w:val="17"/>
               </w:rPr>
-              <w:t xml:space="preserve">4.00</w:t>
-            </w:r>
-          </w:p>
-        </w:tc>
-        <w:tc>
-          <w:tcPr>
-            <w:tcW w:type="dxa" w:w="780"/>
+              <w:t xml:space="preserve">3.30</w:t>
+            </w:r>
+          </w:p>
+        </w:tc>
+        <w:tc>
+          <w:tcPr>
+            <w:tcW w:type="dxa" w:w="860"/>
             <w:tcBorders>
               <w:top w:val="single" w:color="999999" w:sz="4"/>
               <w:left w:val="single" w:color="999999" w:sz="4"/>
@@ -17216,7 +17216,7 @@
                 <w:sz w:val="17"/>
                 <w:szCs w:val="17"/>
               </w:rPr>
-              <w:t xml:space="preserve">50.0</w:t>
+              <w:t xml:space="preserve">42.9</w:t>
             </w:r>
           </w:p>
         </w:tc>
@@ -17248,13 +17248,13 @@
                 <w:sz w:val="17"/>
                 <w:szCs w:val="17"/>
               </w:rPr>
-              <w:t xml:space="preserve">6.0</w:t>
-            </w:r>
-          </w:p>
-        </w:tc>
-        <w:tc>
-          <w:tcPr>
-            <w:tcW w:type="dxa" w:w="650"/>
+              <w:t xml:space="preserve">5.3</w:t>
+            </w:r>
+          </w:p>
+        </w:tc>
+        <w:tc>
+          <w:tcPr>
+            <w:tcW w:type="dxa" w:w="700"/>
             <w:tcBorders>
               <w:top w:val="single" w:color="999999" w:sz="4"/>
               <w:left w:val="single" w:color="999999" w:sz="4"/>
@@ -17280,13 +17280,13 @@
                 <w:sz w:val="17"/>
                 <w:szCs w:val="17"/>
               </w:rPr>
-              <w:t xml:space="preserve">13.8k</w:t>
-            </w:r>
-          </w:p>
-        </w:tc>
-        <w:tc>
-          <w:tcPr>
-            <w:tcW w:type="dxa" w:w="950"/>
+              <w:t xml:space="preserve">13.1k</w:t>
+            </w:r>
+          </w:p>
+        </w:tc>
+        <w:tc>
+          <w:tcPr>
+            <w:tcW w:type="dxa" w:w="1050"/>
             <w:tcBorders>
               <w:top w:val="single" w:color="999999" w:sz="4"/>
               <w:left w:val="single" w:color="999999" w:sz="4"/>
@@ -17312,7 +17312,7 @@
                 <w:sz w:val="17"/>
                 <w:szCs w:val="17"/>
               </w:rPr>
-              <w:t xml:space="preserve">152</w:t>
+              <w:t xml:space="preserve">140</w:t>
             </w:r>
           </w:p>
         </w:tc>
@@ -17323,7 +17323,7 @@
         </w:trPr>
         <w:tc>
           <w:tcPr>
-            <w:tcW w:type="dxa" w:w="2426"/>
+            <w:tcW w:type="dxa" w:w="2226"/>
             <w:tcBorders>
               <w:top w:val="single" w:color="999999" w:sz="4"/>
               <w:left w:val="single" w:color="999999" w:sz="4"/>
@@ -17381,13 +17381,13 @@
                 <w:sz w:val="17"/>
                 <w:szCs w:val="17"/>
               </w:rPr>
-              <w:t xml:space="preserve">3</w:t>
-            </w:r>
-          </w:p>
-        </w:tc>
-        <w:tc>
-          <w:tcPr>
-            <w:tcW w:type="dxa" w:w="620"/>
+              <w:t xml:space="preserve">11</w:t>
+            </w:r>
+          </w:p>
+        </w:tc>
+        <w:tc>
+          <w:tcPr>
+            <w:tcW w:type="dxa" w:w="600"/>
             <w:tcBorders>
               <w:top w:val="single" w:color="999999" w:sz="4"/>
               <w:left w:val="single" w:color="999999" w:sz="4"/>
@@ -17413,13 +17413,13 @@
                 <w:sz w:val="17"/>
                 <w:szCs w:val="17"/>
               </w:rPr>
-              <w:t xml:space="preserve">100.0</w:t>
-            </w:r>
-          </w:p>
-        </w:tc>
-        <w:tc>
-          <w:tcPr>
-            <w:tcW w:type="dxa" w:w="620"/>
+              <w:t xml:space="preserve">90.9</w:t>
+            </w:r>
+          </w:p>
+        </w:tc>
+        <w:tc>
+          <w:tcPr>
+            <w:tcW w:type="dxa" w:w="600"/>
             <w:tcBorders>
               <w:top w:val="single" w:color="999999" w:sz="4"/>
               <w:left w:val="single" w:color="999999" w:sz="4"/>
@@ -17445,13 +17445,13 @@
                 <w:sz w:val="17"/>
                 <w:szCs w:val="17"/>
               </w:rPr>
-              <w:t xml:space="preserve">33.3</w:t>
-            </w:r>
-          </w:p>
-        </w:tc>
-        <w:tc>
-          <w:tcPr>
-            <w:tcW w:type="dxa" w:w="620"/>
+              <w:t xml:space="preserve">72.7</w:t>
+            </w:r>
+          </w:p>
+        </w:tc>
+        <w:tc>
+          <w:tcPr>
+            <w:tcW w:type="dxa" w:w="560"/>
             <w:tcBorders>
               <w:top w:val="single" w:color="999999" w:sz="4"/>
               <w:left w:val="single" w:color="999999" w:sz="4"/>
@@ -17483,7 +17483,7 @@
         </w:tc>
         <w:tc>
           <w:tcPr>
-            <w:tcW w:type="dxa" w:w="650"/>
+            <w:tcW w:type="dxa" w:w="700"/>
             <w:tcBorders>
               <w:top w:val="single" w:color="999999" w:sz="4"/>
               <w:left w:val="single" w:color="999999" w:sz="4"/>
@@ -17515,7 +17515,7 @@
         </w:tc>
         <w:tc>
           <w:tcPr>
-            <w:tcW w:type="dxa" w:w="800"/>
+            <w:tcW w:type="dxa" w:w="820"/>
             <w:tcBorders>
               <w:top w:val="single" w:color="999999" w:sz="4"/>
               <w:left w:val="single" w:color="999999" w:sz="4"/>
@@ -17541,13 +17541,13 @@
                 <w:sz w:val="17"/>
                 <w:szCs w:val="17"/>
               </w:rPr>
-              <w:t xml:space="preserve">3.67</w:t>
-            </w:r>
-          </w:p>
-        </w:tc>
-        <w:tc>
-          <w:tcPr>
-            <w:tcW w:type="dxa" w:w="780"/>
+              <w:t xml:space="preserve">2.73</w:t>
+            </w:r>
+          </w:p>
+        </w:tc>
+        <w:tc>
+          <w:tcPr>
+            <w:tcW w:type="dxa" w:w="860"/>
             <w:tcBorders>
               <w:top w:val="single" w:color="999999" w:sz="4"/>
               <w:left w:val="single" w:color="999999" w:sz="4"/>
@@ -17573,7 +17573,7 @@
                 <w:sz w:val="17"/>
                 <w:szCs w:val="17"/>
               </w:rPr>
-              <w:t xml:space="preserve">33.3</w:t>
+              <w:t xml:space="preserve">66.7</w:t>
             </w:r>
           </w:p>
         </w:tc>
@@ -17605,13 +17605,13 @@
                 <w:sz w:val="17"/>
                 <w:szCs w:val="17"/>
               </w:rPr>
-              <w:t xml:space="preserve">5.7</w:t>
-            </w:r>
-          </w:p>
-        </w:tc>
-        <w:tc>
-          <w:tcPr>
-            <w:tcW w:type="dxa" w:w="650"/>
+              <w:t xml:space="preserve">4.7</w:t>
+            </w:r>
+          </w:p>
+        </w:tc>
+        <w:tc>
+          <w:tcPr>
+            <w:tcW w:type="dxa" w:w="700"/>
             <w:tcBorders>
               <w:top w:val="single" w:color="999999" w:sz="4"/>
               <w:left w:val="single" w:color="999999" w:sz="4"/>
@@ -17637,13 +17637,13 @@
                 <w:sz w:val="17"/>
                 <w:szCs w:val="17"/>
               </w:rPr>
-              <w:t xml:space="preserve">14.7k</w:t>
-            </w:r>
-          </w:p>
-        </w:tc>
-        <w:tc>
-          <w:tcPr>
-            <w:tcW w:type="dxa" w:w="950"/>
+              <w:t xml:space="preserve">12.0k</w:t>
+            </w:r>
+          </w:p>
+        </w:tc>
+        <w:tc>
+          <w:tcPr>
+            <w:tcW w:type="dxa" w:w="1050"/>
             <w:tcBorders>
               <w:top w:val="single" w:color="999999" w:sz="4"/>
               <w:left w:val="single" w:color="999999" w:sz="4"/>
@@ -17669,7 +17669,7 @@
                 <w:sz w:val="17"/>
                 <w:szCs w:val="17"/>
               </w:rPr>
-              <w:t xml:space="preserve">164</w:t>
+              <w:t xml:space="preserve">130</w:t>
             </w:r>
           </w:p>
         </w:tc>
@@ -17680,7 +17680,7 @@
         </w:trPr>
         <w:tc>
           <w:tcPr>
-            <w:tcW w:type="dxa" w:w="2426"/>
+            <w:tcW w:type="dxa" w:w="2226"/>
             <w:tcBorders>
               <w:top w:val="single" w:color="999999" w:sz="4"/>
               <w:left w:val="single" w:color="999999" w:sz="4"/>
@@ -17738,13 +17738,13 @@
                 <w:sz w:val="17"/>
                 <w:szCs w:val="17"/>
               </w:rPr>
-              <w:t xml:space="preserve">1</w:t>
-            </w:r>
-          </w:p>
-        </w:tc>
-        <w:tc>
-          <w:tcPr>
-            <w:tcW w:type="dxa" w:w="620"/>
+              <w:t xml:space="preserve">9</w:t>
+            </w:r>
+          </w:p>
+        </w:tc>
+        <w:tc>
+          <w:tcPr>
+            <w:tcW w:type="dxa" w:w="600"/>
             <w:tcBorders>
               <w:top w:val="single" w:color="999999" w:sz="4"/>
               <w:left w:val="single" w:color="999999" w:sz="4"/>
@@ -17770,13 +17770,13 @@
                 <w:sz w:val="17"/>
                 <w:szCs w:val="17"/>
               </w:rPr>
-              <w:t xml:space="preserve">100.0</w:t>
-            </w:r>
-          </w:p>
-        </w:tc>
-        <w:tc>
-          <w:tcPr>
-            <w:tcW w:type="dxa" w:w="620"/>
+              <w:t xml:space="preserve">88.9</w:t>
+            </w:r>
+          </w:p>
+        </w:tc>
+        <w:tc>
+          <w:tcPr>
+            <w:tcW w:type="dxa" w:w="600"/>
             <w:tcBorders>
               <w:top w:val="single" w:color="999999" w:sz="4"/>
               <w:left w:val="single" w:color="999999" w:sz="4"/>
@@ -17802,13 +17802,13 @@
                 <w:sz w:val="17"/>
                 <w:szCs w:val="17"/>
               </w:rPr>
-              <w:t xml:space="preserve">0.0</w:t>
-            </w:r>
-          </w:p>
-        </w:tc>
-        <w:tc>
-          <w:tcPr>
-            <w:tcW w:type="dxa" w:w="620"/>
+              <w:t xml:space="preserve">55.6</w:t>
+            </w:r>
+          </w:p>
+        </w:tc>
+        <w:tc>
+          <w:tcPr>
+            <w:tcW w:type="dxa" w:w="560"/>
             <w:tcBorders>
               <w:top w:val="single" w:color="999999" w:sz="4"/>
               <w:left w:val="single" w:color="999999" w:sz="4"/>
@@ -17840,7 +17840,7 @@
         </w:tc>
         <w:tc>
           <w:tcPr>
-            <w:tcW w:type="dxa" w:w="650"/>
+            <w:tcW w:type="dxa" w:w="700"/>
             <w:tcBorders>
               <w:top w:val="single" w:color="999999" w:sz="4"/>
               <w:left w:val="single" w:color="999999" w:sz="4"/>
@@ -17872,7 +17872,7 @@
         </w:tc>
         <w:tc>
           <w:tcPr>
-            <w:tcW w:type="dxa" w:w="800"/>
+            <w:tcW w:type="dxa" w:w="820"/>
             <w:tcBorders>
               <w:top w:val="single" w:color="999999" w:sz="4"/>
               <w:left w:val="single" w:color="999999" w:sz="4"/>
@@ -17898,13 +17898,13 @@
                 <w:sz w:val="17"/>
                 <w:szCs w:val="17"/>
               </w:rPr>
-              <w:t xml:space="preserve">5.00</w:t>
-            </w:r>
-          </w:p>
-        </w:tc>
-        <w:tc>
-          <w:tcPr>
-            <w:tcW w:type="dxa" w:w="780"/>
+              <w:t xml:space="preserve">3.22</w:t>
+            </w:r>
+          </w:p>
+        </w:tc>
+        <w:tc>
+          <w:tcPr>
+            <w:tcW w:type="dxa" w:w="860"/>
             <w:tcBorders>
               <w:top w:val="single" w:color="999999" w:sz="4"/>
               <w:left w:val="single" w:color="999999" w:sz="4"/>
@@ -17930,7 +17930,7 @@
                 <w:sz w:val="17"/>
                 <w:szCs w:val="17"/>
               </w:rPr>
-              <w:t xml:space="preserve">0.0</w:t>
+              <w:t xml:space="preserve">42.9</w:t>
             </w:r>
           </w:p>
         </w:tc>
@@ -17962,13 +17962,13 @@
                 <w:sz w:val="17"/>
                 <w:szCs w:val="17"/>
               </w:rPr>
-              <w:t xml:space="preserve">7.0</w:t>
-            </w:r>
-          </w:p>
-        </w:tc>
-        <w:tc>
-          <w:tcPr>
-            <w:tcW w:type="dxa" w:w="650"/>
+              <w:t xml:space="preserve">5.2</w:t>
+            </w:r>
+          </w:p>
+        </w:tc>
+        <w:tc>
+          <w:tcPr>
+            <w:tcW w:type="dxa" w:w="700"/>
             <w:tcBorders>
               <w:top w:val="single" w:color="999999" w:sz="4"/>
               <w:left w:val="single" w:color="999999" w:sz="4"/>
@@ -17994,13 +17994,13 @@
                 <w:sz w:val="17"/>
                 <w:szCs w:val="17"/>
               </w:rPr>
-              <w:t xml:space="preserve">16.9k</w:t>
-            </w:r>
-          </w:p>
-        </w:tc>
-        <w:tc>
-          <w:tcPr>
-            <w:tcW w:type="dxa" w:w="950"/>
+              <w:t xml:space="preserve">12.3k</w:t>
+            </w:r>
+          </w:p>
+        </w:tc>
+        <w:tc>
+          <w:tcPr>
+            <w:tcW w:type="dxa" w:w="1050"/>
             <w:tcBorders>
               <w:top w:val="single" w:color="999999" w:sz="4"/>
               <w:left w:val="single" w:color="999999" w:sz="4"/>
@@ -18026,7 +18026,7 @@
                 <w:sz w:val="17"/>
                 <w:szCs w:val="17"/>
               </w:rPr>
-              <w:t xml:space="preserve">183</w:t>
+              <w:t xml:space="preserve">129</w:t>
             </w:r>
           </w:p>
         </w:tc>
@@ -18044,7 +18044,16 @@
         <w:jc w:val="both"/>
       </w:pPr>
       <w:r>
-        <w:t xml:space="preserve">On these scenarios the validated workflow always protected the plant (100% plant success), and a single unvalidated LLM call did not (0–25%). Its actions were applied blindly, and most chose a setpoint the degraded heater could not reach. The more telling numbers are agent success and recovery. The LLM itself produced a validated action in only 0–67% of workflow episodes; the rest were rescued by the deterministic fallback. Episodes needed 2.7–5 reprompts on average, only 0–50% of reprompted episodes recovered, and each workflow decision cost 12–17 thousand tokens and 2–3 minutes. This mirrors the low recovery rates of GPT-4o-mini in the base paper [1] and is the first direct evidence for Gap 2. With n of 1–4 per cell, these numbers are indicative only.</w:t>
+        <w:t xml:space="preserve">A single unvalidated LLM call was unreliable and, for the smaller model, unsafe. gpt-oss-120b succeeded in 41.7% of episodes and gpt-oss-20b in 20.0%. Both mostly kept setpoints the faulted heater could no longer reach (0% on heat loss and insulation loss), and gpt-oss-20b caused a safety violation in 2 of 10 episodes. The validated base workflow kept the plant safe in every episode, with 100% plant success with the matched twin and 89–91% with the nominal twin. But the LLM itself found a validated action in only 56–73% of episodes; the deterministic fallback handled the rest. Episodes needed 2.4–3.3 reprompts on average, only 33–67% of reprompted episodes recovered, and each decision cost 11–13 thousand tokens and about two minutes. This mirrors the low recovery rates of GPT-4o-mini in the base paper [1] and is direct evidence for Gap 2.</w:t>
+      </w:r>
+    </w:p>
+    <w:p>
+      <w:pPr>
+        <w:spacing w:after="120" w:line="264"/>
+        <w:jc w:val="both"/>
+      </w:pPr>
+      <w:r>
+        <w:t xml:space="preserve">Two further observations matter for the proposal. First, on these mostly feasibility-type faults the physics-based non-LLM baselines are strong (rule table 83.3%, DE 91.7%), because in these seed-0 scenarios the fault magnitudes happen to lie close to the nominal values those methods assume (for example a sensor bias of −9.66 °C against an assumed −10 °C, and heat loss ×3.15 against ×3.0). The LLM workflow is therefore not yet better than a well-tuned optimiser on plant success; its advantage lies in handling faults whose nature, not only size, must be inferred, and this is where G1–G3 aim. Second, the fallback is not always sufficient: in one of the two sensor-bias scenarios, both models exhausted the reprompt budget with the nominal twin, and the fallback's setpoint derate cannot correct a biased sensor, so the plant stayed off target. With roughly ten episodes per method, these LLM numbers are indicative; Phase 2 adds repeats and confidence intervals.</w:t>
       </w:r>
     </w:p>
     <w:p>
@@ -18058,7 +18067,7 @@
           <wp:inline distT="0" distB="0" distL="0" distR="0">
             <wp:extent cx="4476750" cy="3619500"/>
             <wp:effectExtent t="0" r="0" b="0" l="0"/>
-            <wp:docPr id="5" name="fig_llm_subset_plant_success.png" descr="Plant success of all methods on the four scenarios covered by the LLM runs (n per bar shown)." title="Plant success of all methods on the four scenarios covered by the LLM runs (n per bar shown)."/>
+            <wp:docPr id="5" name="fig_llm_subset_plant_success.png" descr="Plant success of all methods on the scenarios covered by the LLM runs (n per bar shown)." title="Plant success of all methods on the scenarios covered by the LLM runs (n per bar shown)."/>
             <wp:cNvGraphicFramePr>
               <a:graphicFrameLocks xmlns:a="http://schemas.openxmlformats.org/drawingml/2006/main" noChangeAspect="1"/>
             </wp:cNvGraphicFramePr>
@@ -18114,7 +18123,7 @@
           <w:sz w:val="20"/>
           <w:szCs w:val="20"/>
         </w:rPr>
-        <w:t xml:space="preserve">Plant success of all methods on the four scenarios covered by the LLM runs (n per bar shown).</w:t>
+        <w:t xml:space="preserve">Plant success of all methods on the scenarios covered by the LLM runs (n per bar shown).</w:t>
       </w:r>
     </w:p>
     <w:p>
@@ -18132,10 +18141,10 @@
           <w:b/>
           <w:bCs/>
         </w:rPr>
-        <w:t xml:space="preserve">Systematic mode error (Gap 2).</w:t>
-      </w:r>
-      <w:r>
-        <w:t xml:space="preserve"> In p1-z2-heater_degradation-mm00-s0 the planner chose RETUNE for a heater whose setpoint had become physically unreachable. The twin showed 100% heater output and a 2.4 °C shortfall. Because validator feedback goes to the Action Agent, which can only change gains, the agent raised Kc from 6 to 10 to 20 without effect until the budget ran out and the fallback derated the zone. A feasible-bound message such as "the highest reachable temperature is 47.6 °C" would have pointed to DERATE.</w:t>
+        <w:t xml:space="preserve">Wrong sign that feedback cannot fix (Gap 2).</w:t>
+      </w:r>
+      <w:r>
+        <w:t xml:space="preserve"> In p1-z2-sensor_bias-mm00-s0 (true bias −9.66 °C), gpt-oss-20b proposed an offset of −9.65 °C, copying the sign of the residual, when +9.66 °C was needed. Used as a single unvalidated call, this offset drove the true heater temperature to 68.9 °C, 9 °C above the safety limit. In the validated workflow the same error was caught (twin prediction 68.9 °C), but the feedback named only the violated checks, so the model kept trying the same sign (−5, −15, −9 °C) until the fallback took over. With the matched twin, the same model proposed +9.65 °C at once and passed. An explicit counterexample such as "the corrected reading moves away from the true temperature; reverse the sign" is the kind of feedback G2 adds.</w:t>
       </w:r>
     </w:p>
     <w:p>
@@ -18153,10 +18162,10 @@
           <w:b/>
           <w:bCs/>
         </w:rPr>
-        <w:t xml:space="preserve">Correct action rejected by a wrong twin (Gap 1).</w:t>
-      </w:r>
-      <w:r>
-        <w:t xml:space="preserve"> In a development run of p1-z2-sensor_bias-mm20-s1, gpt-oss-20b read the residual and proposed a +7.5 °C offset for a true bias of −7.7 °C, which is almost exactly right. The nominal twin assumes a −10 °C bias, so it judged the offset 2.5 °C short and rejected it five times, after which the fallback took over. A wrong twin can therefore block good actions as well as approve bad ones.</w:t>
+        <w:t xml:space="preserve">Systematic mode error (Gap 2).</w:t>
+      </w:r>
+      <w:r>
+        <w:t xml:space="preserve"> In p1-z2-heater_degradation-mm00-s0 the planner chose RETUNE for a heater whose setpoint had become physically unreachable. The twin showed 100% heater output and a 2.4 °C shortfall. Because validator feedback goes to the Action Agent, which can only change gains, the agent raised Kc from 6 to 10 to 20 without effect until the budget ran out and the fallback derated the zone. A feasible-bound message such as "the highest reachable temperature is 47.6 °C" would have pointed to DERATE.</w:t>
       </w:r>
     </w:p>
     <w:p>
@@ -18165,7 +18174,7 @@
         <w:jc w:val="both"/>
       </w:pPr>
       <w:r>
-        <w:t xml:space="preserve">Together these results show that the platform works end to end with real LLMs. They show that the baseline reproduces the base paper's behaviour (high plant safety thanks to validation and fallback, but weak recovery by the LLM itself), and that each of the three selected gaps already shows up in the data. Phase 2 starts from this baseline, completes the LLM runs (resumable with scripts/run_eval.py), and adds the G1–G3 components.</w:t>
+        <w:t xml:space="preserve">Together these results show that the platform works end to end with real LLMs. They show that the baseline reproduces the base paper's behaviour (high plant safety thanks to validation and fallback, but weak recovery by the LLM itself), and that each of the three selected gaps already shows up in the data. Phase 2 starts from this baseline, adds repeated runs, and implements the G1–G3 components.</w:t>
       </w:r>
     </w:p>
     <w:p>
@@ -18956,8 +18965,29 @@
         <w:szCs w:val="18"/>
       </w:rPr>
       <w:fldChar w:fldCharType="begin"/>
+    </w:r>
+    <w:r>
+      <w:rPr>
+        <w:color w:val="7F7F7F"/>
+        <w:sz w:val="18"/>
+        <w:szCs w:val="18"/>
+      </w:rPr>
       <w:instrText xml:space="preserve">PAGE</w:instrText>
+    </w:r>
+    <w:r>
+      <w:rPr>
+        <w:color w:val="7F7F7F"/>
+        <w:sz w:val="18"/>
+        <w:szCs w:val="18"/>
+      </w:rPr>
       <w:fldChar w:fldCharType="separate"/>
+    </w:r>
+    <w:r>
+      <w:rPr>
+        <w:color w:val="7F7F7F"/>
+        <w:sz w:val="18"/>
+        <w:szCs w:val="18"/>
+      </w:rPr>
       <w:fldChar w:fldCharType="end"/>
     </w:r>
   </w:p>
@@ -18985,8 +19015,29 @@
         <w:szCs w:val="18"/>
       </w:rPr>
       <w:fldChar w:fldCharType="begin"/>
+    </w:r>
+    <w:r>
+      <w:rPr>
+        <w:color w:val="7F7F7F"/>
+        <w:sz w:val="18"/>
+        <w:szCs w:val="18"/>
+      </w:rPr>
       <w:instrText xml:space="preserve">PAGE</w:instrText>
+    </w:r>
+    <w:r>
+      <w:rPr>
+        <w:color w:val="7F7F7F"/>
+        <w:sz w:val="18"/>
+        <w:szCs w:val="18"/>
+      </w:rPr>
       <w:fldChar w:fldCharType="separate"/>
+    </w:r>
+    <w:r>
+      <w:rPr>
+        <w:color w:val="7F7F7F"/>
+        <w:sz w:val="18"/>
+        <w:szCs w:val="18"/>
+      </w:rPr>
       <w:fldChar w:fldCharType="end"/>
     </w:r>
   </w:p>
@@ -19014,8 +19065,29 @@
         <w:szCs w:val="18"/>
       </w:rPr>
       <w:fldChar w:fldCharType="begin"/>
+    </w:r>
+    <w:r>
+      <w:rPr>
+        <w:color w:val="7F7F7F"/>
+        <w:sz w:val="18"/>
+        <w:szCs w:val="18"/>
+      </w:rPr>
       <w:instrText xml:space="preserve">PAGE</w:instrText>
+    </w:r>
+    <w:r>
+      <w:rPr>
+        <w:color w:val="7F7F7F"/>
+        <w:sz w:val="18"/>
+        <w:szCs w:val="18"/>
+      </w:rPr>
       <w:fldChar w:fldCharType="separate"/>
+    </w:r>
+    <w:r>
+      <w:rPr>
+        <w:color w:val="7F7F7F"/>
+        <w:sz w:val="18"/>
+        <w:szCs w:val="18"/>
+      </w:rPr>
       <w:fldChar w:fldCharType="end"/>
     </w:r>
   </w:p>

</xml_diff>